<commit_message>
fix Login.jsx and Register.jsx
</commit_message>
<xml_diff>
--- a/Claude outputs/Ujjwal_Tiwari_Resume_Final.docx
+++ b/Claude outputs/Ujjwal_Tiwari_Resume_Final.docx
@@ -210,7 +210,7 @@
           <w:sz w:val="20"/>
           <w:szCs w:val="20"/>
         </w:rPr>
-        <w:t xml:space="preserve">Java, C++, JavaScript, SQL</w:t>
+        <w:t xml:space="preserve">Java, JavaScript, SQL</w:t>
       </w:r>
     </w:p>
     <w:p>
@@ -239,7 +239,7 @@
           <w:sz w:val="20"/>
           <w:szCs w:val="20"/>
         </w:rPr>
-        <w:t xml:space="preserve">HTML, CSS, React.js, Bootstrap, Tailwind CSS</w:t>
+        <w:t xml:space="preserve">HTML5, CSS3, React.js, Bootstrap, Tailwind CSS</w:t>
       </w:r>
     </w:p>
     <w:p>
@@ -268,7 +268,7 @@
           <w:sz w:val="20"/>
           <w:szCs w:val="20"/>
         </w:rPr>
-        <w:t xml:space="preserve">Node.js, Express.js</w:t>
+        <w:t xml:space="preserve">Node.js, Express.js, RESTful API Design</w:t>
       </w:r>
     </w:p>
     <w:p>
@@ -326,7 +326,7 @@
           <w:sz w:val="20"/>
           <w:szCs w:val="20"/>
         </w:rPr>
-        <w:t xml:space="preserve">Git/GitHub, Render, Vercel, Cloudinary</w:t>
+        <w:t xml:space="preserve">Git/GitHub, Render, Vercel, VS Code, Postman</w:t>
       </w:r>
     </w:p>
     <w:p>
@@ -355,7 +355,7 @@
           <w:sz w:val="20"/>
           <w:szCs w:val="20"/>
         </w:rPr>
-        <w:t xml:space="preserve">Data Structures &amp; Algorithms, OOP, DBMS</w:t>
+        <w:t xml:space="preserve">Data Structures &amp; Algorithms, OOP, DBMS, Operating System, Computer Networks</w:t>
       </w:r>
     </w:p>
     <w:p>

</xml_diff>